<commit_message>
Update file 57: full official agency names throughout (md + docx + build script)
Co-Authored-By: Claude Opus 4.8 (1M context) <noreply@anthropic.com>
</commit_message>
<xml_diff>
--- a/57_COE_Creative_Economy_BDI-format.docx
+++ b/57_COE_Creative_Economy_BDI-format.docx
@@ -81,7 +81,7 @@
           <w:b w:val="0"/>
           <w:sz w:val="30"/>
         </w:rPr>
-        <w:t>ประเทศไทยกำลังก้าวสู่การประยุกต์ใช้ AI อย่างเป็นระบบ โดยอุตสาหกรรมสร้างสรรค์ (ภาพยนตร์ แอนิเมชัน เกม เพลง คอนเทนต์ โฆษณา ออกแบบ) เป็นหนึ่งในเป้าหมายสำคัญที่ AI สามารถเป็นตัวคูณผลิตภาพ ลดต้นทุนการผลิต เพิ่มความเร็ว และเปิดตลาดส่งออกได้ทันที ปัจจุบันเศรษฐกิจสร้างสรรค์คิดเป็นร้อยละ 8.78 ของ GDP (รายงาน CEA พฤษภาคม 2569) ซึ่งหากใส่ AI เป็นตัวเร่ง คือการอัปเกรดทั้งฐาน มิใช่สร้างใหม่จากศูนย์</w:t>
+        <w:t>ประเทศไทยกำลังก้าวสู่การประยุกต์ใช้ปัญญาประดิษฐ์อย่างเป็นระบบ โดยอุตสาหกรรมสร้างสรรค์ (ภาพยนตร์ แอนิเมชัน เกม เพลง คอนเทนต์ โฆษณา ออกแบบ) เป็นหนึ่งในเป้าหมายสำคัญที่ปัญญาประดิษฐ์สามารถเป็นตัวคูณผลิตภาพ ลดต้นทุนการผลิต เพิ่มความเร็ว และเปิดตลาดส่งออกได้ทันที ปัจจุบันเศรษฐกิจสร้างสรรค์คิดเป็นร้อยละ 8.78 ของผลิตภัณฑ์มวลรวมในประเทศ (รายงานสำนักงานส่งเสริมเศรษฐกิจสร้างสรรค์ (องค์การมหาชน) พฤษภาคม 2569) ซึ่งหากใส่ปัญญาประดิษฐ์เป็นตัวเร่ง คือการอัปเกรดทั้งฐาน มิใช่สร้างใหม่จากศูนย์</w:t>
       </w:r>
     </w:p>
     <w:p>
@@ -94,7 +94,7 @@
           <w:b w:val="0"/>
           <w:sz w:val="30"/>
         </w:rPr>
-        <w:t>อย่างไรก็ดี ระบบนิเวศ AI สำหรับงานสร้างสรรค์ไทยยังขาดกลไกที่เชื่อมทั้งวงจร ตั้งแต่ข้อมูล–การผลิต–การตรวจคุณภาพ–การรับรอง–ตลาด–การเทียบวัด แผนงานนี้จึงมุ่งจัดให้เกิดกลไกขับเคลื่อนระดับชาติที่ดำเนินงานในรูปเครือข่ายความร่วมมือ (mechanism &amp; network) โดยใช้ประโยชน์จากงบประมาณและโปรแกรมที่หน่วยงานรัฐมีอยู่เดิม (leverage/co-fund) และสนับสนุนแบบจ่ายเมื่อเกิดผล (pay-for-outcome) มิใช่การจัดตั้งศูนย์ อาคาร หรือสถาบันขึ้นใหม่ ทั้งนี้เพื่อสร้างความน่าเชื่อถือ คุ้มครองสิทธิผู้สร้างสรรค์ในยุค AI และผลักดันให้คอนเทนต์/เครื่องมือ AI ไทยเข้าสู่ตลาดทั้งในและต่างประเทศ สอดคล้องกับแผนปฏิบัติการพัฒนาระบบนิเวศปัญญาประดิษฐ์แห่งชาติ (ทั้งสี่ยุทธศาสตร์ IGNITE/GROW/GOVERN/EQUIP) และวางไทยสู่การเป็นศูนย์กลางเศรษฐกิจสร้างสรรค์ที่ขับเคลื่อนด้วย AI ของอาเซียนอย่างยั่งยืน</w:t>
+        <w:t>อย่างไรก็ดี ระบบนิเวศปัญญาประดิษฐ์สำหรับงานสร้างสรรค์ไทยยังขาดกลไกที่เชื่อมทั้งวงจร ตั้งแต่ข้อมูล–การผลิต–การตรวจคุณภาพ–การรับรอง–ตลาด–การเทียบวัด แผนงานนี้จึงมุ่งจัดให้เกิดกลไกขับเคลื่อนระดับชาติที่ดำเนินงานในรูปเครือข่ายความร่วมมือ (mechanism &amp; network) โดยใช้ประโยชน์จากงบประมาณและโปรแกรมที่หน่วยงานรัฐมีอยู่เดิม (leverage/co-fund) และสนับสนุนแบบจ่ายเมื่อเกิดผล (pay-for-outcome) มิใช่การจัดตั้งศูนย์ อาคาร หรือสถาบันขึ้นใหม่ ทั้งนี้เพื่อสร้างความน่าเชื่อถือ คุ้มครองสิทธิผู้สร้างสรรค์ในยุคปัญญาประดิษฐ์ และผลักดันให้คอนเทนต์/เครื่องมือปัญญาประดิษฐ์ไทยเข้าสู่ตลาดทั้งในและต่างประเทศ สอดคล้องกับแผนปฏิบัติการพัฒนาระบบนิเวศปัญญาประดิษฐ์แห่งชาติ (ทั้งสี่ยุทธศาสตร์ IGNITE/GROW/GOVERN/EQUIP) และวางประเทศไทยสู่การเป็นศูนย์กลางเศรษฐกิจสร้างสรรค์ที่ขับเคลื่อนด้วยปัญญาประดิษฐ์ของอาเซียนอย่างยั่งยืน</w:t>
       </w:r>
     </w:p>
     <w:p>
@@ -155,7 +155,7 @@
           <w:rFonts w:ascii="TH Sarabun New" w:hAnsi="TH Sarabun New" w:cs="TH Sarabun New"/>
           <w:sz w:val="30"/>
         </w:rPr>
-        <w:t xml:space="preserve"> จัดให้มีคลังสิทธิ์งานสร้างสรรค์และบัญชีความยินยอม (consent ledger) ที่ลิขสิทธิ์ถูกต้อง ป้อนชุดข้อมูลสร้างสรรค์ไทยเข้าสู่ ThaiLLM พร้อมกลไกจ่ายค่าตอบแทนคืนผู้สร้างสรรค์ (royalty) โดยใช้โครงสร้างพื้นฐานของ BDI/NECTEC ที่มีอยู่</w:t>
+        <w:t xml:space="preserve"> จัดให้มีคลังสิทธิ์งานสร้างสรรค์และบัญชีความยินยอม (consent ledger) ที่ลิขสิทธิ์ถูกต้อง ป้อนชุดข้อมูลสร้างสรรค์ไทยเข้าสู่โครงการโมเดลภาษาขนาดใหญ่ไทย (ThaiLLM) พร้อมกลไกจ่ายค่าตอบแทนคืนผู้สร้างสรรค์ (royalty) โดยใช้โครงสร้างพื้นฐานของสถาบันข้อมูลขนาดใหญ่ (องค์การมหาชน) และศูนย์เทคโนโลยีอิเล็กทรอนิกส์และคอมพิวเตอร์แห่งชาติ (เนคเทค) สำนักงานพัฒนาวิทยาศาสตร์และเทคโนโลยีแห่งชาติ ที่มีอยู่</w:t>
       </w:r>
     </w:p>
     <w:p>
@@ -177,7 +177,7 @@
           <w:rFonts w:ascii="TH Sarabun New" w:hAnsi="TH Sarabun New" w:cs="TH Sarabun New"/>
           <w:sz w:val="30"/>
         </w:rPr>
-        <w:t xml:space="preserve"> สนับสนุนผู้ประกอบการ/ครีเอเตอร์ให้ใช้เครื่องมือ AI ลดต้นทุนและผลิตงานจริง ผ่านกลไกคูปอง/เครดิต (leverage สสว. BDS, depa) และกลไกคืนเงินค่าผลิต (cash rebate ร่วม BOI) รวมถึงสายการผลิตพากย์/แปลคอนเทนต์ด้วย AI</w:t>
+        <w:t xml:space="preserve"> สนับสนุนผู้ประกอบการ/ครีเอเตอร์ให้ใช้เครื่องมือปัญญาประดิษฐ์ลดต้นทุนและผลิตงานจริง ผ่านกลไกคูปอง/เครดิต (ใช้ประโยชน์จากโปรแกรมของสำนักงานส่งเสริมวิสาหกิจขนาดกลางและขนาดย่อม และสำนักงานส่งเสริมเศรษฐกิจดิจิทัล) และกลไกคืนเงินค่าผลิต (cash rebate) ร่วมกับสำนักงานคณะกรรมการส่งเสริมการลงทุน รวมถึงสายการผลิตพากย์/แปลคอนเทนต์ด้วยปัญญาประดิษฐ์</w:t>
       </w:r>
     </w:p>
     <w:p>
@@ -199,7 +199,7 @@
           <w:rFonts w:ascii="TH Sarabun New" w:hAnsi="TH Sarabun New" w:cs="TH Sarabun New"/>
           <w:sz w:val="30"/>
         </w:rPr>
-        <w:t xml:space="preserve"> จัดให้มีตรารับรองคุณภาพและความถูกต้องเชิงภาษา-วัฒนธรรม สำหรับงานแปล/พากย์/ผลงานสร้างสรรค์ที่ใช้ AI โดยประสานราชบัณฑิตยสภาและ ETDA</w:t>
+        <w:t xml:space="preserve"> จัดให้มีตรารับรองคุณภาพและความถูกต้องเชิงภาษา-วัฒนธรรม สำหรับงานแปล/พากย์/ผลงานสร้างสรรค์ที่ใช้ปัญญาประดิษฐ์ โดยประสานสำนักงานราชบัณฑิตยสภาและสำนักงานพัฒนาธุรกรรมทางอิเล็กทรอนิกส์</w:t>
       </w:r>
     </w:p>
     <w:p>
@@ -221,7 +221,7 @@
           <w:rFonts w:ascii="TH Sarabun New" w:hAnsi="TH Sarabun New" w:cs="TH Sarabun New"/>
           <w:sz w:val="30"/>
         </w:rPr>
-        <w:t xml:space="preserve"> จัดให้มีระบบรับรองแหล่งที่มา (C2PA) ผ่านเกณฑ์ EU AI Act มาตรา 50 และทะเบียนทรัพย์สินทางปัญญา เพื่อให้คอนเทนต์ไทยผ่านด่านตลาดต่างประเทศ โดยประสาน ETDA สมอ. และกรมทรัพย์สินทางปัญญา</w:t>
+        <w:t xml:space="preserve"> จัดให้มีระบบรับรองแหล่งที่มา (C2PA) ผ่านเกณฑ์กฎหมายปัญญาประดิษฐ์สหภาพยุโรป (EU AI Act) มาตรา 50 และทะเบียนทรัพย์สินทางปัญญา เพื่อให้คอนเทนต์ไทยผ่านด่านตลาดต่างประเทศ โดยประสานสำนักงานพัฒนาธุรกรรมทางอิเล็กทรอนิกส์ สำนักงานมาตรฐานผลิตภัณฑ์อุตสาหกรรม และกรมทรัพย์สินทางปัญญา</w:t>
       </w:r>
     </w:p>
     <w:p>
@@ -243,7 +243,7 @@
           <w:rFonts w:ascii="TH Sarabun New" w:hAnsi="TH Sarabun New" w:cs="TH Sarabun New"/>
           <w:sz w:val="30"/>
         </w:rPr>
-        <w:t xml:space="preserve"> ผลักดันผลงาน/เครื่องมือ/IP สร้างสรรค์ของไทยเข้าสู่ตลาดและการส่งออก ผ่านกลไกของ DITP, BOI, EXIM และเวทีจับคู่ธุรกิจ รวมถึงเกม/อีสปอร์ตและการรับจ้างผลิต (service export)</w:t>
+        <w:t xml:space="preserve"> ผลักดันผลงาน/เครื่องมือ/ทรัพย์สินทางปัญญาสร้างสรรค์ของไทยเข้าสู่ตลาดและการส่งออก ผ่านกลไกของกรมส่งเสริมการค้าระหว่างประเทศ สำนักงานคณะกรรมการส่งเสริมการลงทุน และธนาคารเพื่อการส่งออกและนำเข้าแห่งประเทศไทย รวมถึงเวทีจับคู่ธุรกิจ เกม/อีสปอร์ต และการรับจ้างผลิต (service export)</w:t>
       </w:r>
     </w:p>
     <w:p>
@@ -265,7 +265,7 @@
           <w:rFonts w:ascii="TH Sarabun New" w:hAnsi="TH Sarabun New" w:cs="TH Sarabun New"/>
           <w:sz w:val="30"/>
         </w:rPr>
-        <w:t xml:space="preserve"> จัดทำชุดทดสอบและมาตรฐานคุณภาพงานสร้างสรรค์ AI ภาษา/วัฒนธรรมไทย เพื่อเป็นมาตรฐานอ้างอิงระดับชาติและภูมิภาค</w:t>
+        <w:t xml:space="preserve"> จัดทำชุดทดสอบและมาตรฐานคุณภาพงานสร้างสรรค์ปัญญาประดิษฐ์ ภาษา/วัฒนธรรมไทย เพื่อเป็นมาตรฐานอ้างอิงระดับชาติและภูมิภาค</w:t>
       </w:r>
     </w:p>
     <w:p>
@@ -361,7 +361,7 @@
           <w:rFonts w:ascii="TH Sarabun New" w:hAnsi="TH Sarabun New" w:cs="TH Sarabun New"/>
           <w:sz w:val="30"/>
         </w:rPr>
-        <w:t>CEA · depa · NIA · BDI · NECTEC / สวทช.</w:t>
+        <w:t>สำนักงานส่งเสริมเศรษฐกิจสร้างสรรค์ (องค์การมหาชน) · สำนักงานส่งเสริมเศรษฐกิจดิจิทัล · สำนักงานนวัตกรรมแห่งชาติ (องค์การมหาชน) · สถาบันข้อมูลขนาดใหญ่ (องค์การมหาชน) · ศูนย์เทคโนโลยีอิเล็กทรอนิกส์และคอมพิวเตอร์แห่งชาติ (เนคเทค) / สำนักงานพัฒนาวิทยาศาสตร์และเทคโนโลยีแห่งชาติ</w:t>
       </w:r>
     </w:p>
     <w:p>
@@ -375,7 +375,7 @@
           <w:rFonts w:ascii="TH Sarabun New" w:hAnsi="TH Sarabun New" w:cs="TH Sarabun New"/>
           <w:sz w:val="30"/>
         </w:rPr>
-        <w:t>DITP · สสว. · BOI · EXIM</w:t>
+        <w:t>กรมส่งเสริมการค้าระหว่างประเทศ กระทรวงพาณิชย์ · สำนักงานส่งเสริมวิสาหกิจขนาดกลางและขนาดย่อม · สำนักงานคณะกรรมการส่งเสริมการลงทุน · ธนาคารเพื่อการส่งออกและนำเข้าแห่งประเทศไทย</w:t>
       </w:r>
     </w:p>
     <w:p>
@@ -389,7 +389,7 @@
           <w:rFonts w:ascii="TH Sarabun New" w:hAnsi="TH Sarabun New" w:cs="TH Sarabun New"/>
           <w:sz w:val="30"/>
         </w:rPr>
-        <w:t>ETDA · สมอ. · กรมทรัพย์สินทางปัญญา · สำนักงานราชบัณฑิตยสภา</w:t>
+        <w:t>สำนักงานพัฒนาธุรกรรมทางอิเล็กทรอนิกส์ · สำนักงานมาตรฐานผลิตภัณฑ์อุตสาหกรรม · กรมทรัพย์สินทางปัญญา กระทรวงพาณิชย์ · สำนักงานราชบัณฑิตยสภา</w:t>
       </w:r>
     </w:p>
     <w:p>
@@ -403,7 +403,7 @@
           <w:rFonts w:ascii="TH Sarabun New" w:hAnsi="TH Sarabun New" w:cs="TH Sarabun New"/>
           <w:sz w:val="30"/>
         </w:rPr>
-        <w:t>สมาคมวิชาชีพ: TACGA · DAAT · สมาคมผู้กำกับภาพยนตร์ไทย · สมาคมคอนเทนต์ครีเอเตอร์ไทย · MarTech · Thai IoT · DUGA · สมาคมสมาพันธ์โอเพนซอร์สแห่งประเทศไทย</w:t>
+        <w:t>สมาคมวิชาชีพ/ภาคเอกชน: สมาคมผู้ประกอบการแอนิเมชันและคอมพิวเตอร์กราฟิกไทย (TACGA) · สมาคมโฆษณาดิจิทัล (ประเทศไทย) (DAAT) · สมาคมผู้กำกับภาพยนตร์ไทย · สมาคมคอนเทนต์ครีเอเตอร์ไทย · สมาคมเทคโนโลยีการตลาดแห่งประเทศไทย (MarTech) · สมาคมไทยไอโอที (Thai IoT) · สมาคมผู้ใช้ดิจิทัลไทย (DUGA) · สมาคมสมาพันธ์โอเพนซอร์สแห่งประเทศไทย</w:t>
       </w:r>
     </w:p>
     <w:p>
@@ -417,7 +417,7 @@
           <w:rFonts w:ascii="TH Sarabun New" w:hAnsi="TH Sarabun New" w:cs="TH Sarabun New"/>
           <w:sz w:val="30"/>
         </w:rPr>
-        <w:t>แหล่งทุนที่ร่วม leverage: กองทุนพัฒนาสื่อปลอดภัยและสร้างสรรค์ · กองทุนพัฒนาดิจิทัลฯ (DE Fund) · กองทุน ววน./บพข. · กองทุน กทปส.</w:t>
+        <w:t>แหล่งทุนที่ร่วม leverage: กองทุนพัฒนาสื่อปลอดภัยและสร้างสรรค์ · กองทุนพัฒนาดิจิทัลเพื่อเศรษฐกิจและสังคม · กองทุนส่งเสริมวิทยาศาสตร์ วิจัยและนวัตกรรม (ววน.) โดยหน่วยบริหารและจัดการทุนด้านการเพิ่มความสามารถในการแข่งขันของประเทศ (บพข.) · กองทุนวิจัยและพัฒนากิจการกระจายเสียง กิจการโทรทัศน์ และกิจการโทรคมนาคม เพื่อประโยชน์สาธารณะ (กทปส.)</w:t>
       </w:r>
     </w:p>
     <w:p>

</xml_diff>